<commit_message>
Finalize model report updates and generated 20260920_models_1353 output
Co-authored-by: dreamcheap2000 <229635625+dreamcheap2000@users.noreply.github.com>
</commit_message>
<xml_diff>
--- a/20260909_Table1_2016.docx
+++ b/20260909_Table1_2016.docx
@@ -22,7 +22,7 @@
         <w:rPr>
           <w:sz w:val="16"/>
         </w:rPr>
-        <w:t>Panel A summarizes Part 2 IPCW binary classification performance across the retained 20260909 models. Panel B shows Part 1 stable bootstrap LASSO coefficients carried forward from the retained 20260904 models, using the same 20260909 ranks, model labels, publication names, and acronyms.</w:t>
+        <w:t>Panel A summarizes Part 2 IPCW binary classification performance across the retained 20260909 models. Best/Worst columns are hypothetical bounds under assumed labels, while 'Validated' columns are restricted to observed 6MWT4 outcomes only. Panel B shows Part 1 stable bootstrap LASSO coefficients carried forward from the retained 20260904 models, using the same 20260909 ranks, model labels, publication names, and acronyms.</w:t>
       </w:r>
     </w:p>
     <w:p>
@@ -207,7 +207,7 @@
                 <w:color w:val="FFFFFF"/>
                 <w:sz w:val="14"/>
               </w:rPr>
-              <w:t>Best Se [95% CI]</w:t>
+              <w:t>Validated Best BalAcc [95% CI]</w:t>
             </w:r>
           </w:p>
         </w:tc>
@@ -226,7 +226,7 @@
                 <w:color w:val="FFFFFF"/>
                 <w:sz w:val="14"/>
               </w:rPr>
-              <w:t>Best Sp [95% CI]</w:t>
+              <w:t>Validated Best n</w:t>
             </w:r>
           </w:p>
         </w:tc>
@@ -283,7 +283,7 @@
                 <w:color w:val="FFFFFF"/>
                 <w:sz w:val="14"/>
               </w:rPr>
-              <w:t>Worst Se [95% CI]</w:t>
+              <w:t>Validated Worst BalAcc [95% CI]</w:t>
             </w:r>
           </w:p>
         </w:tc>
@@ -302,7 +302,7 @@
                 <w:color w:val="FFFFFF"/>
                 <w:sz w:val="14"/>
               </w:rPr>
-              <w:t>Worst Sp [95% CI]</w:t>
+              <w:t>Validated Worst n</w:t>
             </w:r>
           </w:p>
         </w:tc>
@@ -459,7 +459,7 @@
                 <w:color w:val="FFFFFF"/>
                 <w:sz w:val="14"/>
               </w:rPr>
-              <w:t>82.9% [70.0, 89.6]</w:t>
+              <w:t>N/A</w:t>
             </w:r>
           </w:p>
         </w:tc>
@@ -478,7 +478,7 @@
                 <w:color w:val="FFFFFF"/>
                 <w:sz w:val="14"/>
               </w:rPr>
-              <w:t>78.3% [70.0, 93.3]</w:t>
+              <w:t>511</w:t>
             </w:r>
           </w:p>
         </w:tc>
@@ -535,7 +535,7 @@
                 <w:color w:val="FFFFFF"/>
                 <w:sz w:val="14"/>
               </w:rPr>
-              <w:t>88.1% [72.4, 91.3]</w:t>
+              <w:t>N/A</w:t>
             </w:r>
           </w:p>
         </w:tc>
@@ -554,7 +554,7 @@
                 <w:color w:val="FFFFFF"/>
                 <w:sz w:val="14"/>
               </w:rPr>
-              <w:t>77.4% [70.4, 90.7]</w:t>
+              <w:t>511</w:t>
             </w:r>
           </w:p>
         </w:tc>
@@ -700,7 +700,7 @@
                 <w:b w:val="0"/>
                 <w:sz w:val="14"/>
               </w:rPr>
-              <w:t>66.7% [60.0, 83.4]</w:t>
+              <w:t>N/A</w:t>
             </w:r>
           </w:p>
         </w:tc>
@@ -718,7 +718,7 @@
                 <w:b w:val="0"/>
                 <w:sz w:val="14"/>
               </w:rPr>
-              <w:t>88.3% [71.4, 96.7]</w:t>
+              <w:t>511</w:t>
             </w:r>
           </w:p>
         </w:tc>
@@ -772,7 +772,7 @@
                 <w:b w:val="0"/>
                 <w:sz w:val="14"/>
               </w:rPr>
-              <w:t>74.8% [59.3, 81.8]</w:t>
+              <w:t>N/A</w:t>
             </w:r>
           </w:p>
         </w:tc>
@@ -790,7 +790,7 @@
                 <w:b w:val="0"/>
                 <w:sz w:val="14"/>
               </w:rPr>
-              <w:t>81.7% [73.3, 94.4]</w:t>
+              <w:t>511</w:t>
             </w:r>
           </w:p>
         </w:tc>
@@ -939,7 +939,7 @@
                 <w:b w:val="0"/>
                 <w:sz w:val="14"/>
               </w:rPr>
-              <w:t>70.9% [60.8, 80.0]</w:t>
+              <w:t>N/A</w:t>
             </w:r>
           </w:p>
         </w:tc>
@@ -957,7 +957,7 @@
                 <w:b w:val="0"/>
                 <w:sz w:val="14"/>
               </w:rPr>
-              <w:t>86.7% [75.5, 96.4]</w:t>
+              <w:t>511</w:t>
             </w:r>
           </w:p>
         </w:tc>
@@ -1011,7 +1011,7 @@
                 <w:b w:val="0"/>
                 <w:sz w:val="14"/>
               </w:rPr>
-              <w:t>72.0% [56.1, 76.9]</w:t>
+              <w:t>N/A</w:t>
             </w:r>
           </w:p>
         </w:tc>
@@ -1029,7 +1029,7 @@
                 <w:b w:val="0"/>
                 <w:sz w:val="14"/>
               </w:rPr>
-              <w:t>76.3% [68.5, 92.1]</w:t>
+              <w:t>511</w:t>
             </w:r>
           </w:p>
         </w:tc>
@@ -1175,7 +1175,7 @@
                 <w:b w:val="0"/>
                 <w:sz w:val="14"/>
               </w:rPr>
-              <w:t>82.0% [67.0, 85.1]</w:t>
+              <w:t>N/A</w:t>
             </w:r>
           </w:p>
         </w:tc>
@@ -1193,7 +1193,7 @@
                 <w:b w:val="0"/>
                 <w:sz w:val="14"/>
               </w:rPr>
-              <w:t>81.7% [73.8, 94.6]</w:t>
+              <w:t>511</w:t>
             </w:r>
           </w:p>
         </w:tc>
@@ -1247,7 +1247,7 @@
                 <w:b w:val="0"/>
                 <w:sz w:val="14"/>
               </w:rPr>
-              <w:t>75.6% [69.8, 87.6]</w:t>
+              <w:t>N/A</w:t>
             </w:r>
           </w:p>
         </w:tc>
@@ -1265,7 +1265,7 @@
                 <w:b w:val="0"/>
                 <w:sz w:val="14"/>
               </w:rPr>
-              <w:t>87.1% [74.7, 94.7]</w:t>
+              <w:t>511</w:t>
             </w:r>
           </w:p>
         </w:tc>
@@ -1414,7 +1414,7 @@
                 <w:b w:val="0"/>
                 <w:sz w:val="14"/>
               </w:rPr>
-              <w:t>75.6% [72.0, 86.0]</w:t>
+              <w:t>N/A</w:t>
             </w:r>
           </w:p>
         </w:tc>
@@ -1432,7 +1432,7 @@
                 <w:b w:val="0"/>
                 <w:sz w:val="14"/>
               </w:rPr>
-              <w:t>88.3% [75.6, 95.2]</w:t>
+              <w:t>511</w:t>
             </w:r>
           </w:p>
         </w:tc>
@@ -1486,7 +1486,7 @@
                 <w:b w:val="0"/>
                 <w:sz w:val="14"/>
               </w:rPr>
-              <w:t>80.0% [71.6, 86.4]</w:t>
+              <w:t>N/A</w:t>
             </w:r>
           </w:p>
         </w:tc>
@@ -1504,7 +1504,7 @@
                 <w:b w:val="0"/>
                 <w:sz w:val="14"/>
               </w:rPr>
-              <w:t>86.0% [78.3, 94.4]</w:t>
+              <w:t>511</w:t>
             </w:r>
           </w:p>
         </w:tc>

</xml_diff>